<commit_message>
Sync master resume to LinkedIn titles/dates, fix stray BOM reference
Applied the same title and Internet Brands date changes as CLAUDE.md.
Also caught and fixed "BOMs" -> "bills of materials" in both the master
resume and CLAUDE.md — that mr-gay fix had only made it into
linkedin-bullets.md, not the other two.

Co-Authored-By: Claude Sonnet 5 <noreply@anthropic.com>
Claude-Session: https://claude.ai/code/session_01HGwMf3WQEWpBH5LDYWi1id
</commit_message>
<xml_diff>
--- a/Taylor Master Resume.docx
+++ b/Taylor Master Resume.docx
@@ -404,7 +404,7 @@
           <w:sz w:val="20"/>
           <w:szCs w:val="20"/>
         </w:rPr>
-        <w:t xml:space="preserve">Mendix — Director of Content Marketing and Public Relations</w:t>
+        <w:t xml:space="preserve">Mendix — Director of Content and Public Relations</w:t>
       </w:r>
       <w:r>
         <w:rPr>
@@ -523,7 +523,7 @@
           <w:sz w:val="20"/>
           <w:szCs w:val="20"/>
         </w:rPr>
-        <w:t xml:space="preserve">Mendix — Senior Manager, Content Marketing</w:t>
+        <w:t xml:space="preserve">Mendix — Senior Manager, Content Services</w:t>
       </w:r>
       <w:r>
         <w:rPr>
@@ -689,7 +689,7 @@
           <w:sz w:val="20"/>
           <w:szCs w:val="20"/>
         </w:rPr>
-        <w:t xml:space="preserve">Built 4 new SEO-optimized, pain-point-focused content BOMs, recovering a 22% YoY web traffic deficit.</w:t>
+        <w:t xml:space="preserve">Built 4 new SEO-optimized, pain-point-focused content bills of materials, recovering a 22% YoY web traffic deficit.</w:t>
       </w:r>
     </w:p>
     <w:p>
@@ -808,7 +808,7 @@
           <w:sz w:val="20"/>
           <w:szCs w:val="20"/>
         </w:rPr>
-        <w:t xml:space="preserve">Iron Mountain — Marketing Copywriter</w:t>
+        <w:t xml:space="preserve">Iron Mountain — Copywriter</w:t>
       </w:r>
       <w:r>
         <w:rPr>
@@ -1021,7 +1021,7 @@
           <w:sz w:val="20"/>
           <w:szCs w:val="20"/>
         </w:rPr>
-        <w:t xml:space="preserve">Internet Brands — Content Editor &amp; Manager, Retail Marketing</w:t>
+        <w:t xml:space="preserve">Internet Brands — Content Manager &amp; Copywriter</w:t>
       </w:r>
       <w:r>
         <w:rPr>
@@ -1032,7 +1032,7 @@
           <w:sz w:val="18"/>
           <w:szCs w:val="18"/>
         </w:rPr>
-        <w:t xml:space="preserve">	2009 – 2014  |  Remote</w:t>
+        <w:t xml:space="preserve">	Jul 2009 – Jul 2014  |  Remote</w:t>
       </w:r>
     </w:p>
     <w:p>

</xml_diff>

<commit_message>
Add breathing room to resume header: dividers between name, contact, summary, skills
Added rule lines between name/contact, both sides of the summary, and
before Experience on both the master resume and the Agility Robotics
resume. Also fixed a real bug this surfaced: mammoth strips Word paragraph
borders when converting docx to HTML, so the existing section-header rules
were never actually showing up in the rendered PDFs even though they were
present in the .docx files. The PDF pipeline now inserts explicit <hr>
dividers at the right spots so what you see in the PDF preview matches
what's in the Word doc.

Co-Authored-By: Claude Sonnet 5 <noreply@anthropic.com>
Claude-Session: https://claude.ai/code/session_01HGwMf3WQEWpBH5LDYWi1id
</commit_message>
<xml_diff>
--- a/Taylor Master Resume.docx
+++ b/Taylor Master Resume.docx
@@ -20,21 +20,6 @@
     </w:p>
     <w:p>
       <w:pPr>
-        <w:spacing w:after="120"/>
-        <w:jc w:val="center"/>
-      </w:pPr>
-      <w:r>
-        <w:rPr>
-          <w:rFonts w:ascii="Noto Sans" w:cs="Noto Sans" w:eastAsia="Noto Sans" w:hAnsi="Noto Sans"/>
-          <w:color w:val="444444"/>
-          <w:sz w:val="18"/>
-          <w:szCs w:val="18"/>
-        </w:rPr>
-        <w:t xml:space="preserve">Fredericksburg, VA (Remote)  |  617-458-6249  |  taylor.spear@gmail.com  |  taylorbornstein.com  |  linkedin.com/in/taylorscribnerspear</w:t>
-      </w:r>
-    </w:p>
-    <w:p>
-      <w:pPr>
         <w:pBdr>
           <w:bottom w:val="single" w:color="444444" w:sz="6" w:space="1"/>
         </w:pBdr>
@@ -43,6 +28,29 @@
     </w:p>
     <w:p>
       <w:pPr>
+        <w:spacing w:after="120" w:before="60"/>
+        <w:jc w:val="center"/>
+      </w:pPr>
+      <w:r>
+        <w:rPr>
+          <w:rFonts w:ascii="Noto Sans" w:cs="Noto Sans" w:eastAsia="Noto Sans" w:hAnsi="Noto Sans"/>
+          <w:color w:val="444444"/>
+          <w:sz w:val="18"/>
+          <w:szCs w:val="18"/>
+        </w:rPr>
+        <w:t xml:space="preserve">Fredericksburg, VA (Remote)  |  617-458-6249  |  taylor.spear@gmail.com  |  taylorbornstein.com  |  linkedin.com/in/taylorscribnerspear</w:t>
+      </w:r>
+    </w:p>
+    <w:p>
+      <w:pPr>
+        <w:pBdr>
+          <w:bottom w:val="single" w:color="444444" w:sz="6" w:space="1"/>
+        </w:pBdr>
+        <w:spacing w:after="60" w:before="60"/>
+      </w:pPr>
+    </w:p>
+    <w:p>
+      <w:pPr>
         <w:spacing w:after="80" w:before="60"/>
       </w:pPr>
       <w:r>
@@ -56,7 +64,15 @@
     </w:p>
     <w:p>
       <w:pPr>
-        <w:spacing w:after="0"/>
+        <w:pBdr>
+          <w:bottom w:val="single" w:color="444444" w:sz="6" w:space="1"/>
+        </w:pBdr>
+        <w:spacing w:after="60" w:before="60"/>
+      </w:pPr>
+    </w:p>
+    <w:p>
+      <w:pPr>
+        <w:spacing w:after="0" w:before="60"/>
       </w:pPr>
       <w:r>
         <w:rPr>
@@ -69,6 +85,14 @@
         </w:rPr>
         <w:t xml:space="preserve">Content Strategy &amp; Editorial Programs  ·  Thought Leadership &amp; PR  ·  Team Building &amp; Leadership  ·  AI Tooling for Content  ·  SEO / GEO &amp; Attribution  ·  Cross-Functional Collaboration</w:t>
       </w:r>
+    </w:p>
+    <w:p>
+      <w:pPr>
+        <w:pBdr>
+          <w:bottom w:val="single" w:color="444444" w:sz="6" w:space="1"/>
+        </w:pBdr>
+        <w:spacing w:after="60" w:before="60"/>
+      </w:pPr>
     </w:p>
     <w:p>
       <w:pPr>

</xml_diff>

<commit_message>
Remove em dashes from canonical positioning language
Rewrote the Positioning statement and the Bolt.new "personally
write and edit" bullet in CLAUDE.md to drop em dashes, per the
noslops/mr-gay pass. Resynced the Master Resume to match.

Co-Authored-By: Claude Sonnet 5 <noreply@anthropic.com>
Claude-Session: https://claude.ai/code/session_01HGwMf3WQEWpBH5LDYWi1id
</commit_message>
<xml_diff>
--- a/Taylor Master Resume.docx
+++ b/Taylor Master Resume.docx
@@ -59,7 +59,7 @@
           <w:sz w:val="20"/>
           <w:szCs w:val="20"/>
         </w:rPr>
-        <w:t xml:space="preserve">Content and communications director who builds the systems — editorial infrastructure, AI tooling, measurement, and teams — that let technical companies say something worth reading, consistently. Runs both editorial craft and pipeline attribution; builds the AI tooling other candidates have only used.</w:t>
+        <w:t xml:space="preserve">Content and communications director who builds the systems that let technical companies say something worth reading, consistently: editorial infrastructure, AI tooling, measurement, and teams. Runs both editorial craft and pipeline attribution; builds the AI tooling other candidates have only used.</w:t>
       </w:r>
     </w:p>
     <w:p>
@@ -320,7 +320,7 @@
           <w:sz w:val="20"/>
           <w:szCs w:val="20"/>
         </w:rPr>
-        <w:t xml:space="preserve">Personally write and edit ongoing blog posts, customer stories, and web copy — stays hands-on with execution while setting the strategy the rest of the team builds against.</w:t>
+        <w:t xml:space="preserve">Personally write and edit ongoing blog posts, customer stories, and web copy, staying hands-on with execution while setting the strategy the rest of the team builds against.</w:t>
       </w:r>
     </w:p>
     <w:p>

</xml_diff>